<commit_message>
paper: U2 add parent Project DOI (79M5J) + 06_analysis DOI (Q4XKB) in Methods Software section
</commit_message>
<xml_diff>
--- a/metaanalysis/paper/split/01_title_declarations.docx
+++ b/metaanalysis/paper/split/01_title_declarations.docx
@@ -282,7 +282,7 @@
           <w:rFonts w:ascii="Times New Roman" w:hAnsi="Times New Roman" w:eastAsia="Times New Roman"/>
           <w:sz w:val="24"/>
         </w:rPr>
-        <w:t>This systematic review and meta-analysis was pre-registered on OSF Registries (https://osf.io/e5w47/; DOI: 10.17605/OSF.IO/E5W47) on April 23, 2026, prior to formal data extraction and quantitative synthesis. The full protocol (PRISMA-P 2015 compliant) and supplementary materials are publicly available in the associated OSF project (https://osf.io/79m5j/).</w:t>
+        <w:t>This systematic review and meta-analysis was pre-registered on OSF Registries (https://osf.io/e5w47/; DOI: 10.17605/OSF.IO/E5W47) on April 23, 2026, prior to formal data extraction and quantitative synthesis. The full protocol (PRISMA-P 2015 compliant) and supplementary materials are publicly available in the associated OSF project (https://doi.org/10.17605/OSF.IO/79M5J).</w:t>
       </w:r>
     </w:p>
     <w:p>
@@ -312,7 +312,7 @@
           <w:rFonts w:ascii="Times New Roman" w:hAnsi="Times New Roman" w:eastAsia="Times New Roman"/>
           <w:sz w:val="24"/>
         </w:rPr>
-        <w:t>All extracted data, analysis code, search logs, risk-of-bias ratings, figures, and supplementary materials are publicly available on the associated OSF project (https://osf.io/79m5j/). Each component has been assigned a DOI for direct citation: 01_protocol (https://doi.org/10.17605/OSF.IO/7FRGH) — protocol, literature review, deep reading notes, and manuscript drafts; 02_search (https://doi.org/10.17605/OSF.IO/UVJDY) — search log and candidate studies; 03_screening (https://doi.org/10.17605/OSF.IO/YH28G) — PRISMA flow counts (forthcoming); 04_extraction (https://doi.org/10.17605/OSF.IO/5UW98) — data extraction CSV and coding manual; 05_risk_of_bias (https://doi.org/10.17605/OSF.IO/3XYNE) — JBI risk-of-bias ratings (forthcoming); 06_analysis (https://doi.org/10.17605/OSF.IO/Q4XKB) — Python analysis scripts, pooled results, moderator analyses, sensitivity analyses, and generating code for all tables and figures; and 07_pdf_index (https://doi.org/10.17605/OSF.IO/XZ6PT) — DOI index of included studies.</w:t>
+        <w:t>All extracted data, analysis code, search logs, risk-of-bias ratings, figures, and supplementary materials are publicly available on the associated OSF project (https://doi.org/10.17605/OSF.IO/79M5J). Each component has been assigned a DOI for direct citation: 01_protocol (https://doi.org/10.17605/OSF.IO/7FRGH) — protocol, literature review, deep reading notes, and manuscript drafts; 02_search (https://doi.org/10.17605/OSF.IO/UVJDY) — search log and candidate studies; 03_screening (https://doi.org/10.17605/OSF.IO/YH28G) — PRISMA flow counts (forthcoming); 04_extraction (https://doi.org/10.17605/OSF.IO/5UW98) — data extraction CSV and coding manual; 05_risk_of_bias (https://doi.org/10.17605/OSF.IO/3XYNE) — JBI risk-of-bias ratings (forthcoming); 06_analysis (https://doi.org/10.17605/OSF.IO/Q4XKB) — Python analysis scripts, pooled results, moderator analyses, sensitivity analyses, and generating code for all tables and figures; and 07_pdf_index (https://doi.org/10.17605/OSF.IO/XZ6PT) — DOI index of included studies.</w:t>
       </w:r>
     </w:p>
     <w:p>

</xml_diff>